<commit_message>
Profile: record SMS in GHL workflows (do not re-ask). Evergreen resume + cover letter updated, score 79
Co-Authored-By: Claude Opus 5.5 <noreply@anthropic.com>
Claude-Session: https://claude.ai/code/session_01Quz1wQsVbycgj85WWSYfNT
</commit_message>
<xml_diff>
--- a/applications/evergreen-nephrology-marketing-manager-campaigns/resume.docx
+++ b/applications/evergreen-nephrology-marketing-manager-campaigns/resume.docx
@@ -80,7 +80,7 @@
           <w:i w:val="0"/>
           <w:color w:val="1A1A1A"/>
         </w:rPr>
-        <w:t>Marketing operations and campaign manager with 15+ years across agency, MarTech, and B2B SaaS, owning campaigns from planning and asset development through launch, reporting, and optimization. Builds the repeatable infrastructure campaigns run on: templates, messaging frameworks, launch workflows, and 20+ automated lifecycle sequences covering booking, reminders, onboarding, and re-engagement. Experienced coordinating partner-facing programs, including channel sales to healthcare-focused agencies at Birdeye, and writing email, landing-page, and outreach copy that drives engagement.</w:t>
+        <w:t>Marketing operations and campaign manager with 15+ years across agency, MarTech, and B2B SaaS, owning campaigns from planning and asset development through launch, reporting, and optimization. Builds the repeatable infrastructure campaigns run on: templates, messaging frameworks, launch workflows, and 20+ automated SMS and email lifecycle sequences covering booking, reminders, onboarding, and re-engagement. Experienced coordinating partner-facing programs, including channel sales to healthcare-focused agencies at Birdeye, and writing email, landing-page, and outreach copy that drives engagement.</w:t>
       </w:r>
     </w:p>
     <w:p>
@@ -177,7 +177,7 @@
           <w:i w:val="0"/>
           <w:color w:val="1A1A1A"/>
         </w:rPr>
-        <w:t>Architected and deployed 20+ automated lifecycle workflows covering lead capture and routing, appointment booking with confirmations and reminders, no-show recovery, onboarding nurture, long-term reactivation, and review requests.</w:t>
+        <w:t>Architected and deployed 20+ automated SMS and email lifecycle workflows covering lead capture and routing, appointment booking with confirmations and reminders, no-show recovery, onboarding nurture, long-term reactivation, and review requests.</w:t>
       </w:r>
     </w:p>
     <w:p>
@@ -890,7 +890,7 @@
           <w:i w:val="0"/>
           <w:color w:val="1A1A1A"/>
         </w:rPr>
-        <w:t>Email &amp; Lifecycle, Landing Pages &amp; Website Content, Copywriting &amp; Editing, Paid Media, SEO</w:t>
+        <w:t>Email, SMS &amp; Lifecycle, Landing Pages &amp; Website Content, Copywriting &amp; Editing, Paid Media, SEO</w:t>
       </w:r>
     </w:p>
     <w:p>

</xml_diff>